<commit_message>
docs(demo): add step-numbered demo files and link them from the script
- docs/demo/demo-files: input files named <segment>-<who>-<what> so Finder
  sorted by name is the demo order, plus 99-QA-backup for Q&A questions.
  All checked through the real import, ZIP, AutoTrace and preset code.
- Segment 10 now drops a good image with the two bad files: when every
  dropped file fails, the error goes to the drop screen label, which is
  hidden behind the editor.
- Script HTML: file names link to the files, each segment shows its files
  as thumbnails, new Demo files tab, noindex.

Co-Authored-By: Claude Opus 5.5 <noreply@anthropic.com>
</commit_message>
<xml_diff>
--- a/docs/demo/Vectorize-Demo-Script.docx
+++ b/docs/demo/Vectorize-Demo-Script.docx
@@ -163,7 +163,7 @@
         <w:spacing w:after="60"/>
       </w:pPr>
       <w:r>
-        <w:t xml:space="preserve">Make a </w:t>
+        <w:t xml:space="preserve">Copy the </w:t>
       </w:r>
       <w:r>
         <w:rPr>
@@ -172,10 +172,10 @@
           <w:sz w:val="18"/>
           <w:szCs w:val="18"/>
         </w:rPr>
-        <w:t xml:space="preserve">demo-files</w:t>
-      </w:r>
-      <w:r>
-        <w:t xml:space="preserve"> folder on the Desktop with: </w:t>
+        <w:t>docs/demo/demo-files</w:t>
+      </w:r>
+      <w:r>
+        <w:t xml:space="preserve"> folder from the repo to the Desktop and sort Finder by Name. Every file starts with its segment number and who uses it, so the list is the demo order (details in </w:t>
       </w:r>
       <w:r>
         <w:rPr>
@@ -184,10 +184,10 @@
           <w:sz w:val="18"/>
           <w:szCs w:val="18"/>
         </w:rPr>
-        <w:t xml:space="preserve">logo.png</w:t>
-      </w:r>
-      <w:r>
-        <w:t xml:space="preserve"> (flat colours on a plain background, good for Remove Background), </w:t>
+        <w:t>00-START-HERE.md</w:t>
+      </w:r>
+      <w:r>
+        <w:t xml:space="preserve"> inside): </w:t>
       </w:r>
       <w:r>
         <w:rPr>
@@ -196,10 +196,10 @@
           <w:sz w:val="18"/>
           <w:szCs w:val="18"/>
         </w:rPr>
-        <w:t xml:space="preserve">photo.jpg</w:t>
-      </w:r>
-      <w:r>
-        <w:t xml:space="preserve">, </w:t>
+        <w:t>02-Mona-drop-a-logo.png</w:t>
+      </w:r>
+      <w:r>
+        <w:t xml:space="preserve"> (flat colours on a plain background, good for Remove Background), </w:t>
       </w:r>
       <w:r>
         <w:rPr>
@@ -208,7 +208,7 @@
           <w:sz w:val="18"/>
           <w:szCs w:val="18"/>
         </w:rPr>
-        <w:t xml:space="preserve">transparent.png</w:t>
+        <w:t>02-Mona-drop-b-photo.jpg</w:t>
       </w:r>
       <w:r>
         <w:t xml:space="preserve">, </w:t>
@@ -220,10 +220,10 @@
           <w:sz w:val="18"/>
           <w:szCs w:val="18"/>
         </w:rPr>
-        <w:t xml:space="preserve">images.zip</w:t>
-      </w:r>
-      <w:r>
-        <w:t xml:space="preserve"> (3 to 4 JPG/PNG inside), </w:t>
+        <w:t>02-Mona-drop-c-transparent.png</w:t>
+      </w:r>
+      <w:r>
+        <w:t xml:space="preserve">, </w:t>
       </w:r>
       <w:r>
         <w:rPr>
@@ -232,10 +232,10 @@
           <w:sz w:val="18"/>
           <w:szCs w:val="18"/>
         </w:rPr>
-        <w:t xml:space="preserve">broken.jpg</w:t>
-      </w:r>
-      <w:r>
-        <w:t xml:space="preserve"> (a text file renamed to .jpg) and </w:t>
+        <w:t>06-Day-zip-images.zip</w:t>
+      </w:r>
+      <w:r>
+        <w:t xml:space="preserve"> (4 JPG/PNG plus a readme.txt that gets skipped), </w:t>
       </w:r>
       <w:r>
         <w:rPr>
@@ -244,10 +244,34 @@
           <w:sz w:val="18"/>
           <w:szCs w:val="18"/>
         </w:rPr>
-        <w:t xml:space="preserve">notes.txt</w:t>
-      </w:r>
-      <w:r>
-        <w:t xml:space="preserve">.</w:t>
+        <w:t>10-Day-error-a-broken.jpg</w:t>
+      </w:r>
+      <w:r>
+        <w:t xml:space="preserve"> (a text file renamed to .jpg), </w:t>
+      </w:r>
+      <w:r>
+        <w:rPr>
+          <w:rFonts w:ascii="Consolas" w:cs="Consolas" w:eastAsia="Consolas" w:hAnsi="Consolas"/>
+          <w:color w:val="7C2D12"/>
+          <w:sz w:val="18"/>
+          <w:szCs w:val="18"/>
+        </w:rPr>
+        <w:t>10-Day-error-b-notes.txt</w:t>
+      </w:r>
+      <w:r>
+        <w:t xml:space="preserve"> and </w:t>
+      </w:r>
+      <w:r>
+        <w:rPr>
+          <w:rFonts w:ascii="Consolas" w:cs="Consolas" w:eastAsia="Consolas" w:hAnsi="Consolas"/>
+          <w:color w:val="7C2D12"/>
+          <w:sz w:val="18"/>
+          <w:szCs w:val="18"/>
+        </w:rPr>
+        <w:t>10-Day-error-c-good-star.png</w:t>
+      </w:r>
+      <w:r>
+        <w:t>.</w:t>
       </w:r>
     </w:p>
     <w:p>
@@ -260,7 +284,7 @@
         <w:spacing w:after="60"/>
       </w:pPr>
       <w:r>
-        <w:t xml:space="preserve">Make an empty </w:t>
+        <w:t xml:space="preserve">Check that </w:t>
       </w:r>
       <w:r>
         <w:rPr>
@@ -269,10 +293,10 @@
           <w:sz w:val="18"/>
           <w:szCs w:val="18"/>
         </w:rPr>
-        <w:t xml:space="preserve">export-out</w:t>
-      </w:r>
-      <w:r>
-        <w:t xml:space="preserve"> folder for Export All.</w:t>
+        <w:t>09-Day-export-out</w:t>
+      </w:r>
+      <w:r>
+        <w:t xml:space="preserve"> (inside demo-files) is empty before you walk in: delete the SVGs from rehearsal.</w:t>
       </w:r>
     </w:p>
     <w:p>
@@ -2365,16 +2389,16 @@
               <w:spacing w:after="60"/>
             </w:pPr>
             <w:r>
-              <w:t xml:space="preserve">From Finder, drag </w:t>
-            </w:r>
-            <w:r>
-              <w:rPr>
-                <w:rFonts w:ascii="Consolas" w:cs="Consolas" w:eastAsia="Consolas" w:hAnsi="Consolas"/>
-                <w:color w:val="7C2D12"/>
-                <w:sz w:val="18"/>
-                <w:szCs w:val="18"/>
-              </w:rPr>
-              <w:t xml:space="preserve">logo.png</w:t>
+              <w:t xml:space="preserve">From Finder, select </w:t>
+            </w:r>
+            <w:r>
+              <w:rPr>
+                <w:rFonts w:ascii="Consolas" w:cs="Consolas" w:eastAsia="Consolas" w:hAnsi="Consolas"/>
+                <w:color w:val="7C2D12"/>
+                <w:sz w:val="18"/>
+                <w:szCs w:val="18"/>
+              </w:rPr>
+              <w:t>02-Mona-drop-a-logo.png</w:t>
             </w:r>
             <w:r>
               <w:t xml:space="preserve">, </w:t>
@@ -2386,7 +2410,7 @@
                 <w:sz w:val="18"/>
                 <w:szCs w:val="18"/>
               </w:rPr>
-              <w:t xml:space="preserve">photo.jpg</w:t>
+              <w:t>02-Mona-drop-b-photo.jpg</w:t>
             </w:r>
             <w:r>
               <w:t xml:space="preserve"> and </w:t>
@@ -2398,10 +2422,10 @@
                 <w:sz w:val="18"/>
                 <w:szCs w:val="18"/>
               </w:rPr>
-              <w:t xml:space="preserve">transparent.png</w:t>
-            </w:r>
-            <w:r>
-              <w:t xml:space="preserve"> together onto the window.</w:t>
+              <w:t>02-Mona-drop-c-transparent.png</w:t>
+            </w:r>
+            <w:r>
+              <w:t xml:space="preserve"> and drag them together onto the window.</w:t>
             </w:r>
           </w:p>
         </w:tc>
@@ -2894,10 +2918,10 @@
                 <w:sz w:val="18"/>
                 <w:szCs w:val="18"/>
               </w:rPr>
-              <w:t xml:space="preserve">logo.png</w:t>
-            </w:r>
-            <w:r>
-              <w:t xml:space="preserve">. Change Detail from Medium to Low, then to High. Point at the vector preview each time.</w:t>
+              <w:t>02-Mona-drop-a-logo.png</w:t>
+            </w:r>
+            <w:r>
+              <w:t>. Change Detail from Medium to Low, then to High. Point at the vector preview each time.</w:t>
             </w:r>
           </w:p>
         </w:tc>
@@ -3247,19 +3271,19 @@
               <w:spacing w:after="60"/>
             </w:pPr>
             <w:r>
-              <w:t xml:space="preserve">Click Save (Preset) and save as </w:t>
-            </w:r>
-            <w:r>
-              <w:rPr>
-                <w:rFonts w:ascii="Consolas" w:cs="Consolas" w:eastAsia="Consolas" w:hAnsi="Consolas"/>
-                <w:color w:val="7C2D12"/>
-                <w:sz w:val="18"/>
-                <w:szCs w:val="18"/>
-              </w:rPr>
-              <w:t xml:space="preserve">logo-style.properties</w:t>
-            </w:r>
-            <w:r>
-              <w:t xml:space="preserve">. Click Next, click Load and pick the file. Point at the controls changing.</w:t>
+              <w:t xml:space="preserve">Click Save (Preset) and save into demo-files as </w:t>
+            </w:r>
+            <w:r>
+              <w:rPr>
+                <w:rFonts w:ascii="Consolas" w:cs="Consolas" w:eastAsia="Consolas" w:hAnsi="Consolas"/>
+                <w:color w:val="7C2D12"/>
+                <w:sz w:val="18"/>
+                <w:szCs w:val="18"/>
+              </w:rPr>
+              <w:t>05-Mona-preset-logo-style.properties</w:t>
+            </w:r>
+            <w:r>
+              <w:t>. Click Next, click Load and pick the file. Point at the controls changing.</w:t>
             </w:r>
           </w:p>
         </w:tc>
@@ -3456,10 +3480,10 @@
                 <w:sz w:val="18"/>
                 <w:szCs w:val="18"/>
               </w:rPr>
-              <w:t xml:space="preserve">images.zip</w:t>
-            </w:r>
-            <w:r>
-              <w:t xml:space="preserve"> onto the editor. Point at the counter jumping (for example “4 / 7”).</w:t>
+              <w:t>06-Day-zip-images.zip</w:t>
+            </w:r>
+            <w:r>
+              <w:t xml:space="preserve"> onto the editor. Point at the counter: the total jumps from 3 to 7 (for example “2 / 7”), so 4 images were added and, the readme.txt inside was skipped.</w:t>
             </w:r>
           </w:p>
         </w:tc>
@@ -4086,7 +4110,7 @@
                 <w:sz w:val="18"/>
                 <w:szCs w:val="18"/>
               </w:rPr>
-              <w:t xml:space="preserve">export-out</w:t>
+              <w:t>09-Day-export-out</w:t>
             </w:r>
             <w:r>
               <w:t xml:space="preserve"> and confirm.</w:t>
@@ -4206,7 +4230,7 @@
                 <w:sz w:val="18"/>
                 <w:szCs w:val="18"/>
               </w:rPr>
-              <w:t xml:space="preserve">export-out</w:t>
+              <w:t>09-Day-export-out</w:t>
             </w:r>
             <w:r>
               <w:t xml:space="preserve"> in Finder. Double-click an .svg so it opens in the browser, then press Cmd+Plus a few times.</w:t>
@@ -4397,16 +4421,28 @@
               <w:spacing w:after="60"/>
             </w:pPr>
             <w:r>
-              <w:t xml:space="preserve">Drag </w:t>
-            </w:r>
-            <w:r>
-              <w:rPr>
-                <w:rFonts w:ascii="Consolas" w:cs="Consolas" w:eastAsia="Consolas" w:hAnsi="Consolas"/>
-                <w:color w:val="7C2D12"/>
-                <w:sz w:val="18"/>
-                <w:szCs w:val="18"/>
-              </w:rPr>
-              <w:t xml:space="preserve">broken.jpg</w:t>
+              <w:t xml:space="preserve">Select </w:t>
+            </w:r>
+            <w:r>
+              <w:rPr>
+                <w:rFonts w:ascii="Consolas" w:cs="Consolas" w:eastAsia="Consolas" w:hAnsi="Consolas"/>
+                <w:color w:val="7C2D12"/>
+                <w:sz w:val="18"/>
+                <w:szCs w:val="18"/>
+              </w:rPr>
+              <w:t>10-Day-error-a-broken.jpg</w:t>
+            </w:r>
+            <w:r>
+              <w:t xml:space="preserve">, </w:t>
+            </w:r>
+            <w:r>
+              <w:rPr>
+                <w:rFonts w:ascii="Consolas" w:cs="Consolas" w:eastAsia="Consolas" w:hAnsi="Consolas"/>
+                <w:color w:val="7C2D12"/>
+                <w:sz w:val="18"/>
+                <w:szCs w:val="18"/>
+              </w:rPr>
+              <w:t>10-Day-error-b-notes.txt</w:t>
             </w:r>
             <w:r>
               <w:t xml:space="preserve"> and </w:t>
@@ -4418,10 +4454,10 @@
                 <w:sz w:val="18"/>
                 <w:szCs w:val="18"/>
               </w:rPr>
-              <w:t xml:space="preserve">notes.txt</w:t>
-            </w:r>
-            <w:r>
-              <w:t xml:space="preserve"> onto the editor. Point at the messages.</w:t>
+              <w:t>10-Day-error-c-good-star.png</w:t>
+            </w:r>
+            <w:r>
+              <w:t xml:space="preserve"> and drag all three onto the editor. Point at the two error messages under the progress bar and at the counter (the star was added). Always include the good file: if every dropped file fails, the message goes to the hidden drop screen and nothing shows in the editor.</w:t>
             </w:r>
           </w:p>
         </w:tc>
@@ -4447,7 +4483,7 @@
               <w:spacing w:after="60"/>
             </w:pPr>
             <w:r>
-              <w:t xml:space="preserve">“Last, errors. A corrupted JPG and an unsupported file each get a clear message, and the app keeps running. If AutoTrace is not installed, the user is told how to install it instead of seeing a stack trace.”</w:t>
+              <w:t>“Last, errors. I drop a corrupted JPG, an unsupported file and one good image together. The two bad files each get a clear message, the good image is still added, and the app keeps running. If AutoTrace is not installed, the user is told how to install it instead of seeing a stack trace.”</w:t>
             </w:r>
           </w:p>
         </w:tc>

</xml_diff>

<commit_message>
docs(demo): simpler wording for segments 8 and 9
Co-Authored-By: Claude Opus 5.5 <noreply@anthropic.com>
</commit_message>
<xml_diff>
--- a/docs/demo/Vectorize-Demo-Script.docx
+++ b/docs/demo/Vectorize-Demo-Script.docx
@@ -3913,7 +3913,7 @@
               <w:spacing w:after="60"/>
             </w:pPr>
             <w:r>
-              <w:t xml:space="preserve">Show a JPG and a PNG side by side with Back/Next.</w:t>
+              <w:t>Click Next to 02-Mona-drop-b-photo.jpg (a JPG). Point at the original on the left, then the vector on the right. Click Back to 02-Mona-drop-a-logo.png (a PNG) and point the same way.</w:t>
             </w:r>
           </w:p>
         </w:tc>
@@ -3939,7 +3939,7 @@
               <w:spacing w:after="60"/>
             </w:pPr>
             <w:r>
-              <w:t xml:space="preserve">“JPG and PNG go through the same pipeline: resize to the detail level, mask the background, reduce colours, then AutoTrace turns the pixels into paths. Every SVG is validated before we show or save it. If it has no vector shapes or contains an embedded picture, it is rejected.”</w:t>
+              <w:t>“This one is a JPG photo, and this one is a PNG logo. Both become vectors the same way, in four steps. One: we resize the image to match the Detail level. Two: if Remove Background is ticked, we hide the background. Three: we reduce it to the number of colours you picked. Four: AutoTrace draws a shape around each colour area. So the left side is pixels, and the right side is shapes. Before we show or save it, we check that the SVG really is shapes, and not just a photo pasted inside.”</w:t>
             </w:r>
           </w:p>
         </w:tc>
@@ -4193,7 +4193,7 @@
               <w:spacing w:after="60"/>
             </w:pPr>
             <w:r>
-              <w:t xml:space="preserve">“Export also runs in parallel under Medium and Custom, with progress at the bottom, and the UI stays responsive. If one image fails, the others still save, and the bar ends with how many succeeded and how many failed. There is also a Cancel button that stops the running jobs.”</w:t>
+              <w:t>“The bar at the bottom counts the files as they are saved. While it runs, I can still click Back and Next, so the app does not freeze. If one file fails, the other files still save, and at the end the bar says how many worked and how many failed. And if I want to stop, I press Cancel.”</w:t>
             </w:r>
           </w:p>
         </w:tc>

</xml_diff>